<commit_message>
Add remaining project files (report, docs, scripts)
</commit_message>
<xml_diff>
--- a/Resume_Builder_SDD_4_Members.docx
+++ b/Resume_Builder_SDD_4_Members.docx
@@ -3348,6 +3348,38 @@
     </w:p>
     <w:p>
       <w:pPr>
+        <w:pStyle w:val="ListParagraph"/>
+      </w:pPr>
+      <w:r>
+        <w:t>To analyse a users resume against a job description and provide skill gap analysis with proficiency scoring (Job Match Analyzer).</w:t>
+      </w:r>
+    </w:p>
+    <w:p>
+      <w:pPr>
+        <w:pStyle w:val="ListParagraph"/>
+      </w:pPr>
+      <w:r>
+        <w:t>To generate a shareable, public portfolio/CV page accessible via a unique link and QR code (Portfolio Generator).</w:t>
+      </w:r>
+    </w:p>
+    <w:p>
+      <w:pPr>
+        <w:pStyle w:val="ListParagraph"/>
+      </w:pPr>
+      <w:r>
+        <w:t>To integrate job adverts from external platforms (LinkedIn, etc.) into the system for browsing and analysis.</w:t>
+      </w:r>
+    </w:p>
+    <w:p>
+      <w:pPr>
+        <w:pStyle w:val="ListParagraph"/>
+      </w:pPr>
+      <w:r>
+        <w:t>To leverage AI for intelligent skill recommendations, job description parsing, and content improvement suggestions.</w:t>
+      </w:r>
+    </w:p>
+    <w:p>
+      <w:pPr>
         <w:pStyle w:val="Heading2"/>
         <w:spacing w:before="300" w:after="150"/>
       </w:pPr>
@@ -3371,7 +3403,7 @@
           <w:sz w:val="22"/>
           <w:szCs w:val="22"/>
         </w:rPr>
-        <w:t>The system covers account registration and login, a multi-step resume-data wizard (personal details, education, experience, skills, projects, certifications), template selection, live preview, and PDF export. It does not cover payment processing, third-party job-board integration, or real-time collaborative editing; these are noted as possible future extensions.</w:t>
+        <w:t>The system covers account registration and login, a multi-step resume-data wizard (personal details, education, experience, skills, projects, certifications), template selection, live preview, and PDF export. Additionally, the system includes a Job Match Analyzer that scores user skills against job descriptions and recommends improvements, a Portfolio Generator that creates shareable public portfolio pages with QR codes, integration with external job boards (LinkedIn, etc.) for importing and analysing job adverts, and AI capabilities powering job matching, skill recommendations, and content suggestions. The system does not cover payment processing or real-time collaborative editing; these are noted as possible future extensions.</w:t>
       </w:r>
     </w:p>
     <w:p>
@@ -3640,6 +3672,54 @@
           <w:szCs w:val="22"/>
         </w:rPr>
         <w:t>The system shall provide an administrative panel for managing users and templates.</w:t>
+      </w:r>
+    </w:p>
+    <w:p>
+      <w:pPr>
+        <w:pStyle w:val="ListParagraph"/>
+      </w:pPr>
+      <w:r>
+        <w:t>The system shall allow a user to input a job description URL or text and receive a skill gap analysis with proficiency scoring.</w:t>
+      </w:r>
+    </w:p>
+    <w:p>
+      <w:pPr>
+        <w:pStyle w:val="ListParagraph"/>
+      </w:pPr>
+      <w:r>
+        <w:t>The system shall recommend missing or underdeveloped skills based on the analysed job description.</w:t>
+      </w:r>
+    </w:p>
+    <w:p>
+      <w:pPr>
+        <w:pStyle w:val="ListParagraph"/>
+      </w:pPr>
+      <w:r>
+        <w:t>The system shall generate a shareable public portfolio/CV page with a unique URL.</w:t>
+      </w:r>
+    </w:p>
+    <w:p>
+      <w:pPr>
+        <w:pStyle w:val="ListParagraph"/>
+      </w:pPr>
+      <w:r>
+        <w:t>The system shall generate a QR code for the shareable portfolio page.</w:t>
+      </w:r>
+    </w:p>
+    <w:p>
+      <w:pPr>
+        <w:pStyle w:val="ListParagraph"/>
+      </w:pPr>
+      <w:r>
+        <w:t>The system shall allow importing and browsing job adverts from external platforms (LinkedIn, etc.).</w:t>
+      </w:r>
+    </w:p>
+    <w:p>
+      <w:pPr>
+        <w:pStyle w:val="ListParagraph"/>
+      </w:pPr>
+      <w:r>
+        <w:t>The system shall use AI to parse job descriptions and provide intelligent skill recommendations and resume improvement suggestions.</w:t>
       </w:r>
     </w:p>
     <w:p>
@@ -10078,7 +10158,7 @@
           <w:sz w:val="22"/>
           <w:szCs w:val="22"/>
         </w:rPr>
-        <w:t>Django 5.x</w:t>
+        <w:t>Django 6.0.6</w:t>
       </w:r>
     </w:p>
     <w:p>
@@ -10151,7 +10231,7 @@
           <w:sz w:val="22"/>
           <w:szCs w:val="22"/>
         </w:rPr>
-        <w:t>WeasyPrint</w:t>
+        <w:t>xhtml2pdf (HTML-to-PDF generation)</w:t>
       </w:r>
       <w:proofErr w:type="spellEnd"/>
       <w:r>
@@ -10160,7 +10240,6 @@
           <w:sz w:val="22"/>
           <w:szCs w:val="22"/>
         </w:rPr>
-        <w:t xml:space="preserve"> or xhtml2pdf (HTML-to-PDF generation)</w:t>
       </w:r>
     </w:p>
     <w:p>
@@ -10215,6 +10294,22 @@
           <w:szCs w:val="22"/>
         </w:rPr>
         <w:t>)</w:t>
+      </w:r>
+    </w:p>
+    <w:p>
+      <w:pPr>
+        <w:pStyle w:val="ListParagraph"/>
+      </w:pPr>
+      <w:r>
+        <w:t>AI/ML integration (OpenAI API / NLP libraries)</w:t>
+      </w:r>
+    </w:p>
+    <w:p>
+      <w:pPr>
+        <w:pStyle w:val="ListParagraph"/>
+      </w:pPr>
+      <w:r>
+        <w:t>QR code generation library (qrcode)</w:t>
       </w:r>
     </w:p>
     <w:p>
@@ -13876,7 +13971,7 @@
           <w:sz w:val="22"/>
           <w:szCs w:val="22"/>
         </w:rPr>
-        <w:t>Responsibilities are assigned so that every member owns a clear, traceable slice of both the design document and the implementation, while still collaborating on integration, testing, and the final report.</w:t>
+        <w:t>Responsibilities are assigned so that every member owns a clear, traceable slice of both the design document and the implementation, while still collaborating on integration, testing, and the final report. With the addition of new features, responsibilities have been updated as follows: Opoka Eric leads the Portfolio Generator (shareable portfolio pages with QR codes). Opeto Isaac leads the Job Match Analyzer (skill gap analysis and scoring) with AI integration support. Ojok Isaac leads the Job Adverts Integration (importing from LinkedIn and other platforms). Auma Dilish remains the Testing, Documentation and Deployment Lead.</w:t>
       </w:r>
     </w:p>
     <w:tbl>

</xml_diff>